<commit_message>
feat: add desktop launcher (CapacityOptimizerLauncher.pyw) and PyInstaller packaging support
</commit_message>
<xml_diff>
--- a/Capacity_Optimizer_User_Manual_CN.docx
+++ b/Capacity_Optimizer_User_Manual_CN.docx
@@ -3106,6 +3106,1380 @@
           <w:color w:val="1F1F1F"/>
         </w:rPr>
         <w:t>Run_Info</w:t>
+      </w:r>
+    </w:p>
+    <w:p/>
+    <w:p>
+      <w:pPr>
+        <w:pStyle w:val="Heading4"/>
+      </w:pPr>
+      <w:r>
+        <w:rPr>
+          <w:rFonts w:ascii="Calibri" w:hAnsi="Calibri" w:eastAsia="Microsoft YaHei"/>
+        </w:rPr>
+        <w:t>Dashboard 的 WorkCenter 筛选</w:t>
+      </w:r>
+    </w:p>
+    <w:p/>
+    <w:p>
+      <w:pPr>
+        <w:pStyle w:val="Normal"/>
+      </w:pPr>
+      <w:r>
+        <w:rPr>
+          <w:rFonts w:ascii="Calibri" w:hAnsi="Calibri" w:eastAsia="Microsoft YaHei"/>
+        </w:rPr>
+        <w:t xml:space="preserve">从当前版本起，以下页面支持按 </w:t>
+      </w:r>
+      <w:r>
+        <w:rPr>
+          <w:rFonts w:ascii="Consolas" w:hAnsi="Consolas" w:eastAsia="Microsoft YaHei"/>
+          <w:color w:val="1F1F1F"/>
+        </w:rPr>
+        <w:t>WorkCenter</w:t>
+      </w:r>
+      <w:r>
+        <w:rPr>
+          <w:rFonts w:ascii="Calibri" w:hAnsi="Calibri" w:eastAsia="Microsoft YaHei"/>
+        </w:rPr>
+        <w:t xml:space="preserve"> 过滤 Dashboard 数据：</w:t>
+      </w:r>
+    </w:p>
+    <w:p/>
+    <w:p>
+      <w:pPr>
+        <w:pStyle w:val="ListBullet"/>
+        <w:numPr>
+          <w:ilvl w:val="0"/>
+          <w:numId w:val="2"/>
+        </w:numPr>
+      </w:pPr>
+      <w:r>
+        <w:rPr>
+          <w:rFonts w:ascii="Consolas" w:hAnsi="Consolas" w:eastAsia="Microsoft YaHei"/>
+          <w:color w:val="1F1F1F"/>
+        </w:rPr>
+        <w:t>ModeA</w:t>
+      </w:r>
+      <w:r>
+        <w:rPr>
+          <w:rFonts w:ascii="Calibri" w:hAnsi="Calibri" w:eastAsia="Microsoft YaHei"/>
+        </w:rPr>
+        <w:t xml:space="preserve"> 结果 workbook 的 </w:t>
+      </w:r>
+      <w:r>
+        <w:rPr>
+          <w:rFonts w:ascii="Consolas" w:hAnsi="Consolas" w:eastAsia="Microsoft YaHei"/>
+          <w:color w:val="1F1F1F"/>
+        </w:rPr>
+        <w:t>Dashboard</w:t>
+      </w:r>
+    </w:p>
+    <w:p>
+      <w:pPr>
+        <w:pStyle w:val="ListBullet"/>
+        <w:numPr>
+          <w:ilvl w:val="0"/>
+          <w:numId w:val="2"/>
+        </w:numPr>
+      </w:pPr>
+      <w:r>
+        <w:rPr>
+          <w:rFonts w:ascii="Consolas" w:hAnsi="Consolas" w:eastAsia="Microsoft YaHei"/>
+          <w:color w:val="1F1F1F"/>
+        </w:rPr>
+        <w:t>ModeB</w:t>
+      </w:r>
+      <w:r>
+        <w:rPr>
+          <w:rFonts w:ascii="Calibri" w:hAnsi="Calibri" w:eastAsia="Microsoft YaHei"/>
+        </w:rPr>
+        <w:t xml:space="preserve"> 结果 workbook 的 </w:t>
+      </w:r>
+      <w:r>
+        <w:rPr>
+          <w:rFonts w:ascii="Consolas" w:hAnsi="Consolas" w:eastAsia="Microsoft YaHei"/>
+          <w:color w:val="1F1F1F"/>
+        </w:rPr>
+        <w:t>Dashboard</w:t>
+      </w:r>
+    </w:p>
+    <w:p>
+      <w:pPr>
+        <w:pStyle w:val="ListBullet"/>
+        <w:numPr>
+          <w:ilvl w:val="0"/>
+          <w:numId w:val="2"/>
+        </w:numPr>
+      </w:pPr>
+      <w:r>
+        <w:rPr>
+          <w:rFonts w:ascii="Consolas" w:hAnsi="Consolas" w:eastAsia="Microsoft YaHei"/>
+          <w:color w:val="1F1F1F"/>
+        </w:rPr>
+        <w:t>Summary of Mode A and Mode B</w:t>
+      </w:r>
+      <w:r>
+        <w:rPr>
+          <w:rFonts w:ascii="Calibri" w:hAnsi="Calibri" w:eastAsia="Microsoft YaHei"/>
+        </w:rPr>
+        <w:t xml:space="preserve"> workbook 的 </w:t>
+      </w:r>
+      <w:r>
+        <w:rPr>
+          <w:rFonts w:ascii="Consolas" w:hAnsi="Consolas" w:eastAsia="Microsoft YaHei"/>
+          <w:color w:val="1F1F1F"/>
+        </w:rPr>
+        <w:t>Executive_Comparison</w:t>
+      </w:r>
+    </w:p>
+    <w:p/>
+    <w:p>
+      <w:pPr>
+        <w:pStyle w:val="Normal"/>
+      </w:pPr>
+      <w:r>
+        <w:rPr>
+          <w:rFonts w:ascii="Calibri" w:hAnsi="Calibri" w:eastAsia="Microsoft YaHei"/>
+        </w:rPr>
+        <w:t>使用方式如下：</w:t>
+      </w:r>
+    </w:p>
+    <w:p/>
+    <w:p>
+      <w:pPr>
+        <w:pStyle w:val="ListNumber"/>
+        <w:numPr>
+          <w:ilvl w:val="0"/>
+          <w:numId w:val="1"/>
+        </w:numPr>
+      </w:pPr>
+      <w:r>
+        <w:rPr>
+          <w:rFonts w:ascii="Calibri" w:hAnsi="Calibri" w:eastAsia="Microsoft YaHei"/>
+        </w:rPr>
+        <w:t xml:space="preserve">在页面右上角找到 </w:t>
+      </w:r>
+      <w:r>
+        <w:rPr>
+          <w:rFonts w:ascii="Consolas" w:hAnsi="Consolas" w:eastAsia="Microsoft YaHei"/>
+          <w:color w:val="1F1F1F"/>
+        </w:rPr>
+        <w:t>WorkCenter Filter</w:t>
+      </w:r>
+    </w:p>
+    <w:p>
+      <w:pPr>
+        <w:pStyle w:val="ListNumber"/>
+        <w:numPr>
+          <w:ilvl w:val="0"/>
+          <w:numId w:val="1"/>
+        </w:numPr>
+      </w:pPr>
+      <w:r>
+        <w:rPr>
+          <w:rFonts w:ascii="Consolas" w:hAnsi="Consolas" w:eastAsia="Microsoft YaHei"/>
+          <w:color w:val="1F1F1F"/>
+        </w:rPr>
+        <w:t>Selection Mode</w:t>
+      </w:r>
+      <w:r>
+        <w:rPr>
+          <w:rFonts w:ascii="Calibri" w:hAnsi="Calibri" w:eastAsia="Microsoft YaHei"/>
+        </w:rPr>
+        <w:t xml:space="preserve"> 选择：</w:t>
+      </w:r>
+    </w:p>
+    <w:p>
+      <w:pPr>
+        <w:pStyle w:val="ListBullet"/>
+        <w:numPr>
+          <w:ilvl w:val="0"/>
+          <w:numId w:val="2"/>
+        </w:numPr>
+      </w:pPr>
+      <w:r>
+        <w:rPr>
+          <w:rFonts w:ascii="Consolas" w:hAnsi="Consolas" w:eastAsia="Microsoft YaHei"/>
+          <w:color w:val="1F1F1F"/>
+        </w:rPr>
+        <w:t>All</w:t>
+      </w:r>
+      <w:r>
+        <w:rPr>
+          <w:rFonts w:ascii="Calibri" w:hAnsi="Calibri" w:eastAsia="Microsoft YaHei"/>
+        </w:rPr>
+        <w:t>：显示当前 workbook 的全量 Dashboard 数据</w:t>
+      </w:r>
+    </w:p>
+    <w:p>
+      <w:pPr>
+        <w:pStyle w:val="ListBullet"/>
+        <w:numPr>
+          <w:ilvl w:val="0"/>
+          <w:numId w:val="2"/>
+        </w:numPr>
+      </w:pPr>
+      <w:r>
+        <w:rPr>
+          <w:rFonts w:ascii="Consolas" w:hAnsi="Consolas" w:eastAsia="Microsoft YaHei"/>
+          <w:color w:val="1F1F1F"/>
+        </w:rPr>
+        <w:t>Filtered</w:t>
+      </w:r>
+      <w:r>
+        <w:rPr>
+          <w:rFonts w:ascii="Calibri" w:hAnsi="Calibri" w:eastAsia="Microsoft YaHei"/>
+        </w:rPr>
+        <w:t xml:space="preserve">：只显示被选中的 </w:t>
+      </w:r>
+      <w:r>
+        <w:rPr>
+          <w:rFonts w:ascii="Consolas" w:hAnsi="Consolas" w:eastAsia="Microsoft YaHei"/>
+          <w:color w:val="1F1F1F"/>
+        </w:rPr>
+        <w:t>WorkCenter</w:t>
+      </w:r>
+    </w:p>
+    <w:p>
+      <w:pPr>
+        <w:pStyle w:val="ListNumber"/>
+        <w:numPr>
+          <w:ilvl w:val="0"/>
+          <w:numId w:val="1"/>
+        </w:numPr>
+      </w:pPr>
+      <w:r>
+        <w:rPr>
+          <w:rFonts w:ascii="Calibri" w:hAnsi="Calibri" w:eastAsia="Microsoft YaHei"/>
+        </w:rPr>
+        <w:t xml:space="preserve">在 </w:t>
+      </w:r>
+      <w:r>
+        <w:rPr>
+          <w:rFonts w:ascii="Consolas" w:hAnsi="Consolas" w:eastAsia="Microsoft YaHei"/>
+          <w:color w:val="1F1F1F"/>
+        </w:rPr>
+        <w:t>WorkCenter 1</w:t>
+      </w:r>
+      <w:r>
+        <w:rPr>
+          <w:rFonts w:ascii="Calibri" w:hAnsi="Calibri" w:eastAsia="Microsoft YaHei"/>
+        </w:rPr>
+        <w:t xml:space="preserve"> 到 </w:t>
+      </w:r>
+      <w:r>
+        <w:rPr>
+          <w:rFonts w:ascii="Consolas" w:hAnsi="Consolas" w:eastAsia="Microsoft YaHei"/>
+          <w:color w:val="1F1F1F"/>
+        </w:rPr>
+        <w:t>WorkCenter 8</w:t>
+      </w:r>
+      <w:r>
+        <w:rPr>
+          <w:rFonts w:ascii="Calibri" w:hAnsi="Calibri" w:eastAsia="Microsoft YaHei"/>
+        </w:rPr>
+        <w:t xml:space="preserve"> 的下拉框中选择一个或多个资源</w:t>
+      </w:r>
+    </w:p>
+    <w:p>
+      <w:pPr>
+        <w:pStyle w:val="ListNumber"/>
+        <w:numPr>
+          <w:ilvl w:val="0"/>
+          <w:numId w:val="1"/>
+        </w:numPr>
+      </w:pPr>
+      <w:r>
+        <w:rPr>
+          <w:rFonts w:ascii="Calibri" w:hAnsi="Calibri" w:eastAsia="Microsoft YaHei"/>
+        </w:rPr>
+        <w:t>Excel 重算后，Dashboard 上的 KPI、供给结构图、比较图和结论文字会一起变化</w:t>
+      </w:r>
+    </w:p>
+    <w:p/>
+    <w:p>
+      <w:pPr>
+        <w:pStyle w:val="Normal"/>
+      </w:pPr>
+      <w:r>
+        <w:rPr>
+          <w:rFonts w:ascii="Calibri" w:hAnsi="Calibri" w:eastAsia="Microsoft YaHei"/>
+        </w:rPr>
+        <w:t>补充说明：</w:t>
+      </w:r>
+    </w:p>
+    <w:p/>
+    <w:p>
+      <w:pPr>
+        <w:pStyle w:val="ListBullet"/>
+        <w:numPr>
+          <w:ilvl w:val="0"/>
+          <w:numId w:val="2"/>
+        </w:numPr>
+      </w:pPr>
+      <w:r>
+        <w:rPr>
+          <w:rFonts w:ascii="Calibri" w:hAnsi="Calibri" w:eastAsia="Microsoft YaHei"/>
+        </w:rPr>
+        <w:t xml:space="preserve">第一版筛选只联动 </w:t>
+      </w:r>
+      <w:r>
+        <w:rPr>
+          <w:rFonts w:ascii="Consolas" w:hAnsi="Consolas" w:eastAsia="Microsoft YaHei"/>
+          <w:color w:val="1F1F1F"/>
+        </w:rPr>
+        <w:t>Dashboard</w:t>
+      </w:r>
+      <w:r>
+        <w:rPr>
+          <w:rFonts w:ascii="Calibri" w:hAnsi="Calibri" w:eastAsia="Microsoft YaHei"/>
+        </w:rPr>
+        <w:t xml:space="preserve"> / </w:t>
+      </w:r>
+      <w:r>
+        <w:rPr>
+          <w:rFonts w:ascii="Consolas" w:hAnsi="Consolas" w:eastAsia="Microsoft YaHei"/>
+          <w:color w:val="1F1F1F"/>
+        </w:rPr>
+        <w:t>Executive_Comparison</w:t>
+      </w:r>
+      <w:r>
+        <w:rPr>
+          <w:rFonts w:ascii="Calibri" w:hAnsi="Calibri" w:eastAsia="Microsoft YaHei"/>
+        </w:rPr>
+        <w:t xml:space="preserve"> 页面</w:t>
+      </w:r>
+    </w:p>
+    <w:p>
+      <w:pPr>
+        <w:pStyle w:val="ListBullet"/>
+        <w:numPr>
+          <w:ilvl w:val="0"/>
+          <w:numId w:val="2"/>
+        </w:numPr>
+      </w:pPr>
+      <w:r>
+        <w:rPr>
+          <w:rFonts w:ascii="Calibri" w:hAnsi="Calibri" w:eastAsia="Microsoft YaHei"/>
+        </w:rPr>
+        <w:t xml:space="preserve">其他分析页如 </w:t>
+      </w:r>
+      <w:r>
+        <w:rPr>
+          <w:rFonts w:ascii="Consolas" w:hAnsi="Consolas" w:eastAsia="Microsoft YaHei"/>
+          <w:color w:val="1F1F1F"/>
+        </w:rPr>
+        <w:t>Monthly_Trend</w:t>
+      </w:r>
+      <w:r>
+        <w:rPr>
+          <w:rFonts w:ascii="Calibri" w:hAnsi="Calibri" w:eastAsia="Microsoft YaHei"/>
+        </w:rPr>
+        <w:t>、</w:t>
+      </w:r>
+      <w:r>
+        <w:rPr>
+          <w:rFonts w:ascii="Consolas" w:hAnsi="Consolas" w:eastAsia="Microsoft YaHei"/>
+          <w:color w:val="1F1F1F"/>
+        </w:rPr>
+        <w:t>Bottleneck</w:t>
+      </w:r>
+      <w:r>
+        <w:rPr>
+          <w:rFonts w:ascii="Calibri" w:hAnsi="Calibri" w:eastAsia="Microsoft YaHei"/>
+        </w:rPr>
+        <w:t>、</w:t>
+      </w:r>
+      <w:r>
+        <w:rPr>
+          <w:rFonts w:ascii="Consolas" w:hAnsi="Consolas" w:eastAsia="Microsoft YaHei"/>
+          <w:color w:val="1F1F1F"/>
+        </w:rPr>
+        <w:t>WC_Heatmap</w:t>
+      </w:r>
+      <w:r>
+        <w:rPr>
+          <w:rFonts w:ascii="Calibri" w:hAnsi="Calibri" w:eastAsia="Microsoft YaHei"/>
+        </w:rPr>
+        <w:t>、</w:t>
+      </w:r>
+      <w:r>
+        <w:rPr>
+          <w:rFonts w:ascii="Consolas" w:hAnsi="Consolas" w:eastAsia="Microsoft YaHei"/>
+          <w:color w:val="1F1F1F"/>
+        </w:rPr>
+        <w:t>Product_Risk</w:t>
+      </w:r>
+      <w:r>
+        <w:rPr>
+          <w:rFonts w:ascii="Calibri" w:hAnsi="Calibri" w:eastAsia="Microsoft YaHei"/>
+        </w:rPr>
+        <w:t xml:space="preserve"> 仍保持全量显示</w:t>
+      </w:r>
+    </w:p>
+    <w:p>
+      <w:pPr>
+        <w:pStyle w:val="ListBullet"/>
+        <w:numPr>
+          <w:ilvl w:val="0"/>
+          <w:numId w:val="2"/>
+        </w:numPr>
+      </w:pPr>
+      <w:r>
+        <w:rPr>
+          <w:rFonts w:ascii="Calibri" w:hAnsi="Calibri" w:eastAsia="Microsoft YaHei"/>
+        </w:rPr>
+        <w:t xml:space="preserve">如果要恢复全量视图，把 </w:t>
+      </w:r>
+      <w:r>
+        <w:rPr>
+          <w:rFonts w:ascii="Consolas" w:hAnsi="Consolas" w:eastAsia="Microsoft YaHei"/>
+          <w:color w:val="1F1F1F"/>
+        </w:rPr>
+        <w:t>Selection Mode</w:t>
+      </w:r>
+      <w:r>
+        <w:rPr>
+          <w:rFonts w:ascii="Calibri" w:hAnsi="Calibri" w:eastAsia="Microsoft YaHei"/>
+        </w:rPr>
+        <w:t xml:space="preserve"> 改回 </w:t>
+      </w:r>
+      <w:r>
+        <w:rPr>
+          <w:rFonts w:ascii="Consolas" w:hAnsi="Consolas" w:eastAsia="Microsoft YaHei"/>
+          <w:color w:val="1F1F1F"/>
+        </w:rPr>
+        <w:t>All</w:t>
+      </w:r>
+    </w:p>
+    <w:p/>
+    <w:p>
+      <w:pPr>
+        <w:pStyle w:val="Heading4"/>
+      </w:pPr>
+      <w:r>
+        <w:rPr>
+          <w:rFonts w:ascii="Calibri" w:hAnsi="Calibri" w:eastAsia="Microsoft YaHei"/>
+        </w:rPr>
+        <w:t>热力图、瓶颈与产能百分比的显示口径</w:t>
+      </w:r>
+    </w:p>
+    <w:p/>
+    <w:p>
+      <w:pPr>
+        <w:pStyle w:val="Normal"/>
+      </w:pPr>
+      <w:r>
+        <w:rPr>
+          <w:rFonts w:ascii="Calibri" w:hAnsi="Calibri" w:eastAsia="Microsoft YaHei"/>
+        </w:rPr>
+        <w:t>从当前版本起，所有与产能百分比相关的显示口径已经统一调整为**按名义月产能显示**：</w:t>
+      </w:r>
+    </w:p>
+    <w:p/>
+    <w:p>
+      <w:pPr>
+        <w:pStyle w:val="CodeBlock"/>
+      </w:pPr>
+      <w:r>
+        <w:rPr>
+          <w:rFonts w:ascii="Consolas" w:hAnsi="Consolas" w:eastAsia="Microsoft YaHei"/>
+          <w:color w:val="1F1F1F"/>
+        </w:rPr>
+        <w:t>名义月产能 = Annual_Capacity_Tons / 12</w:t>
+      </w:r>
+    </w:p>
+    <w:p/>
+    <w:p>
+      <w:pPr>
+        <w:pStyle w:val="Normal"/>
+      </w:pPr>
+      <w:r>
+        <w:rPr>
+          <w:rFonts w:ascii="Calibri" w:hAnsi="Calibri" w:eastAsia="Microsoft YaHei"/>
+        </w:rPr>
+        <w:t>这意味着：</w:t>
+      </w:r>
+    </w:p>
+    <w:p/>
+    <w:p>
+      <w:pPr>
+        <w:pStyle w:val="ListBullet"/>
+        <w:numPr>
+          <w:ilvl w:val="0"/>
+          <w:numId w:val="2"/>
+        </w:numPr>
+      </w:pPr>
+      <w:r>
+        <w:rPr>
+          <w:rFonts w:ascii="Consolas" w:hAnsi="Consolas" w:eastAsia="Microsoft YaHei"/>
+          <w:color w:val="1F1F1F"/>
+        </w:rPr>
+        <w:t>Utilization_Target</w:t>
+      </w:r>
+      <w:r>
+        <w:rPr>
+          <w:rFonts w:ascii="Calibri" w:hAnsi="Calibri" w:eastAsia="Microsoft YaHei"/>
+        </w:rPr>
+        <w:t xml:space="preserve"> 仍然用于优化求解时限制可用产能</w:t>
+      </w:r>
+    </w:p>
+    <w:p>
+      <w:pPr>
+        <w:pStyle w:val="ListBullet"/>
+        <w:numPr>
+          <w:ilvl w:val="0"/>
+          <w:numId w:val="2"/>
+        </w:numPr>
+      </w:pPr>
+      <w:r>
+        <w:rPr>
+          <w:rFonts w:ascii="Calibri" w:hAnsi="Calibri" w:eastAsia="Microsoft YaHei"/>
+        </w:rPr>
+        <w:t xml:space="preserve">但报表中的 </w:t>
+      </w:r>
+      <w:r>
+        <w:rPr>
+          <w:rFonts w:ascii="Consolas" w:hAnsi="Consolas" w:eastAsia="Microsoft YaHei"/>
+          <w:color w:val="1F1F1F"/>
+        </w:rPr>
+        <w:t>%</w:t>
+      </w:r>
+      <w:r>
+        <w:rPr>
+          <w:rFonts w:ascii="Calibri" w:hAnsi="Calibri" w:eastAsia="Microsoft YaHei"/>
+        </w:rPr>
+        <w:t xml:space="preserve"> 不再按乘完 </w:t>
+      </w:r>
+      <w:r>
+        <w:rPr>
+          <w:rFonts w:ascii="Consolas" w:hAnsi="Consolas" w:eastAsia="Microsoft YaHei"/>
+          <w:color w:val="1F1F1F"/>
+        </w:rPr>
+        <w:t>Utilization_Target</w:t>
+      </w:r>
+      <w:r>
+        <w:rPr>
+          <w:rFonts w:ascii="Calibri" w:hAnsi="Calibri" w:eastAsia="Microsoft YaHei"/>
+        </w:rPr>
+        <w:t xml:space="preserve"> 后的有效产能显示</w:t>
+      </w:r>
+    </w:p>
+    <w:p/>
+    <w:p>
+      <w:pPr>
+        <w:pStyle w:val="Normal"/>
+      </w:pPr>
+      <w:r>
+        <w:rPr>
+          <w:rFonts w:ascii="Calibri" w:hAnsi="Calibri" w:eastAsia="Microsoft YaHei"/>
+        </w:rPr>
+        <w:t>例如：</w:t>
+      </w:r>
+    </w:p>
+    <w:p/>
+    <w:p>
+      <w:pPr>
+        <w:pStyle w:val="ListBullet"/>
+        <w:numPr>
+          <w:ilvl w:val="0"/>
+          <w:numId w:val="2"/>
+        </w:numPr>
+      </w:pPr>
+      <w:r>
+        <w:rPr>
+          <w:rFonts w:ascii="Calibri" w:hAnsi="Calibri" w:eastAsia="Microsoft YaHei"/>
+        </w:rPr>
+        <w:t xml:space="preserve">如果某条资源的名义月产能是 </w:t>
+      </w:r>
+      <w:r>
+        <w:rPr>
+          <w:rFonts w:ascii="Consolas" w:hAnsi="Consolas" w:eastAsia="Microsoft YaHei"/>
+          <w:color w:val="1F1F1F"/>
+        </w:rPr>
+        <w:t>100</w:t>
+      </w:r>
+    </w:p>
+    <w:p>
+      <w:pPr>
+        <w:pStyle w:val="ListBullet"/>
+        <w:numPr>
+          <w:ilvl w:val="0"/>
+          <w:numId w:val="2"/>
+        </w:numPr>
+      </w:pPr>
+      <w:r>
+        <w:rPr>
+          <w:rFonts w:ascii="Consolas" w:hAnsi="Consolas" w:eastAsia="Microsoft YaHei"/>
+          <w:color w:val="1F1F1F"/>
+        </w:rPr>
+        <w:t>Utilization_Target = 0.88</w:t>
+      </w:r>
+    </w:p>
+    <w:p>
+      <w:pPr>
+        <w:pStyle w:val="ListBullet"/>
+        <w:numPr>
+          <w:ilvl w:val="0"/>
+          <w:numId w:val="2"/>
+        </w:numPr>
+      </w:pPr>
+      <w:r>
+        <w:rPr>
+          <w:rFonts w:ascii="Calibri" w:hAnsi="Calibri" w:eastAsia="Microsoft YaHei"/>
+        </w:rPr>
+        <w:t xml:space="preserve">优化可用产能仍然是 </w:t>
+      </w:r>
+      <w:r>
+        <w:rPr>
+          <w:rFonts w:ascii="Consolas" w:hAnsi="Consolas" w:eastAsia="Microsoft YaHei"/>
+          <w:color w:val="1F1F1F"/>
+        </w:rPr>
+        <w:t>88</w:t>
+      </w:r>
+    </w:p>
+    <w:p>
+      <w:pPr>
+        <w:pStyle w:val="ListBullet"/>
+        <w:numPr>
+          <w:ilvl w:val="0"/>
+          <w:numId w:val="2"/>
+        </w:numPr>
+      </w:pPr>
+      <w:r>
+        <w:rPr>
+          <w:rFonts w:ascii="Calibri" w:hAnsi="Calibri" w:eastAsia="Microsoft YaHei"/>
+        </w:rPr>
+        <w:t xml:space="preserve">但如果实际分配量为 </w:t>
+      </w:r>
+      <w:r>
+        <w:rPr>
+          <w:rFonts w:ascii="Consolas" w:hAnsi="Consolas" w:eastAsia="Microsoft YaHei"/>
+          <w:color w:val="1F1F1F"/>
+        </w:rPr>
+        <w:t>88</w:t>
+      </w:r>
+    </w:p>
+    <w:p>
+      <w:pPr>
+        <w:pStyle w:val="ListBullet"/>
+        <w:numPr>
+          <w:ilvl w:val="0"/>
+          <w:numId w:val="2"/>
+        </w:numPr>
+      </w:pPr>
+      <w:r>
+        <w:rPr>
+          <w:rFonts w:ascii="Calibri" w:hAnsi="Calibri" w:eastAsia="Microsoft YaHei"/>
+        </w:rPr>
+        <w:t xml:space="preserve">报表现在显示为 </w:t>
+      </w:r>
+      <w:r>
+        <w:rPr>
+          <w:rFonts w:ascii="Consolas" w:hAnsi="Consolas" w:eastAsia="Microsoft YaHei"/>
+          <w:color w:val="1F1F1F"/>
+        </w:rPr>
+        <w:t>88%</w:t>
+      </w:r>
+    </w:p>
+    <w:p>
+      <w:pPr>
+        <w:pStyle w:val="ListBullet"/>
+        <w:numPr>
+          <w:ilvl w:val="0"/>
+          <w:numId w:val="2"/>
+        </w:numPr>
+      </w:pPr>
+      <w:r>
+        <w:rPr>
+          <w:rFonts w:ascii="Calibri" w:hAnsi="Calibri" w:eastAsia="Microsoft YaHei"/>
+        </w:rPr>
+        <w:t xml:space="preserve">不再显示为 </w:t>
+      </w:r>
+      <w:r>
+        <w:rPr>
+          <w:rFonts w:ascii="Consolas" w:hAnsi="Consolas" w:eastAsia="Microsoft YaHei"/>
+          <w:color w:val="1F1F1F"/>
+        </w:rPr>
+        <w:t>100%</w:t>
+      </w:r>
+    </w:p>
+    <w:p/>
+    <w:p>
+      <w:pPr>
+        <w:pStyle w:val="Normal"/>
+      </w:pPr>
+      <w:r>
+        <w:rPr>
+          <w:rFonts w:ascii="Calibri" w:hAnsi="Calibri" w:eastAsia="Microsoft YaHei"/>
+        </w:rPr>
+        <w:t>当前影响到的主要输出包括：</w:t>
+      </w:r>
+    </w:p>
+    <w:p/>
+    <w:p>
+      <w:pPr>
+        <w:pStyle w:val="ListBullet"/>
+        <w:numPr>
+          <w:ilvl w:val="0"/>
+          <w:numId w:val="2"/>
+        </w:numPr>
+      </w:pPr>
+      <w:r>
+        <w:rPr>
+          <w:rFonts w:ascii="Consolas" w:hAnsi="Consolas" w:eastAsia="Microsoft YaHei"/>
+          <w:color w:val="1F1F1F"/>
+        </w:rPr>
+        <w:t>Allocation_Detail</w:t>
+      </w:r>
+      <w:r>
+        <w:rPr>
+          <w:rFonts w:ascii="Calibri" w:hAnsi="Calibri" w:eastAsia="Microsoft YaHei"/>
+        </w:rPr>
+        <w:t xml:space="preserve"> 中的 </w:t>
+      </w:r>
+      <w:r>
+        <w:rPr>
+          <w:rFonts w:ascii="Consolas" w:hAnsi="Consolas" w:eastAsia="Microsoft YaHei"/>
+          <w:color w:val="1F1F1F"/>
+        </w:rPr>
+        <w:t>CapacityShare_Pct</w:t>
+      </w:r>
+    </w:p>
+    <w:p>
+      <w:pPr>
+        <w:pStyle w:val="ListBullet"/>
+        <w:numPr>
+          <w:ilvl w:val="0"/>
+          <w:numId w:val="2"/>
+        </w:numPr>
+      </w:pPr>
+      <w:r>
+        <w:rPr>
+          <w:rFonts w:ascii="Consolas" w:hAnsi="Consolas" w:eastAsia="Microsoft YaHei"/>
+          <w:color w:val="1F1F1F"/>
+        </w:rPr>
+        <w:t>WC_Load_Pct</w:t>
+      </w:r>
+    </w:p>
+    <w:p>
+      <w:pPr>
+        <w:pStyle w:val="ListBullet"/>
+        <w:numPr>
+          <w:ilvl w:val="0"/>
+          <w:numId w:val="2"/>
+        </w:numPr>
+      </w:pPr>
+      <w:r>
+        <w:rPr>
+          <w:rFonts w:ascii="Consolas" w:hAnsi="Consolas" w:eastAsia="Microsoft YaHei"/>
+          <w:color w:val="1F1F1F"/>
+        </w:rPr>
+        <w:t>Bottleneck</w:t>
+      </w:r>
+      <w:r>
+        <w:rPr>
+          <w:rFonts w:ascii="Calibri" w:hAnsi="Calibri" w:eastAsia="Microsoft YaHei"/>
+        </w:rPr>
+        <w:t xml:space="preserve"> 页中的负荷百分比</w:t>
+      </w:r>
+    </w:p>
+    <w:p>
+      <w:pPr>
+        <w:pStyle w:val="ListBullet"/>
+        <w:numPr>
+          <w:ilvl w:val="0"/>
+          <w:numId w:val="2"/>
+        </w:numPr>
+      </w:pPr>
+      <w:r>
+        <w:rPr>
+          <w:rFonts w:ascii="Consolas" w:hAnsi="Consolas" w:eastAsia="Microsoft YaHei"/>
+          <w:color w:val="1F1F1F"/>
+        </w:rPr>
+        <w:t>WC_Heatmap</w:t>
+      </w:r>
+    </w:p>
+    <w:p>
+      <w:pPr>
+        <w:pStyle w:val="ListBullet"/>
+        <w:numPr>
+          <w:ilvl w:val="0"/>
+          <w:numId w:val="2"/>
+        </w:numPr>
+      </w:pPr>
+      <w:r>
+        <w:rPr>
+          <w:rFonts w:ascii="Consolas" w:hAnsi="Consolas" w:eastAsia="Microsoft YaHei"/>
+          <w:color w:val="1F1F1F"/>
+        </w:rPr>
+        <w:t>Summary</w:t>
+      </w:r>
+      <w:r>
+        <w:rPr>
+          <w:rFonts w:ascii="Calibri" w:hAnsi="Calibri" w:eastAsia="Microsoft YaHei"/>
+        </w:rPr>
+        <w:t xml:space="preserve"> 中与 workcenter 负荷相关的比较页</w:t>
+      </w:r>
+    </w:p>
+    <w:p/>
+    <w:p>
+      <w:pPr>
+        <w:pStyle w:val="Heading4"/>
+      </w:pPr>
+      <w:r>
+        <w:rPr>
+          <w:rFonts w:ascii="Calibri" w:hAnsi="Calibri" w:eastAsia="Microsoft YaHei"/>
+        </w:rPr>
+        <w:t xml:space="preserve">热力图和瓶颈页中的 </w:t>
+      </w:r>
+      <w:r>
+        <w:rPr>
+          <w:rFonts w:ascii="Consolas" w:hAnsi="Consolas" w:eastAsia="Microsoft YaHei"/>
+          <w:color w:val="1F1F1F"/>
+        </w:rPr>
+        <w:t>Unmet</w:t>
+      </w:r>
+      <w:r>
+        <w:rPr>
+          <w:rFonts w:ascii="Calibri" w:hAnsi="Calibri" w:eastAsia="Microsoft YaHei"/>
+        </w:rPr>
+        <w:t xml:space="preserve"> 口径</w:t>
+      </w:r>
+    </w:p>
+    <w:p/>
+    <w:p>
+      <w:pPr>
+        <w:pStyle w:val="Normal"/>
+      </w:pPr>
+      <w:r>
+        <w:rPr>
+          <w:rFonts w:ascii="Calibri" w:hAnsi="Calibri" w:eastAsia="Microsoft YaHei"/>
+        </w:rPr>
+        <w:t>热力图和瓶颈页当前显示的是**资源压力口径**，不是单纯的“已分配内部量”。</w:t>
+      </w:r>
+    </w:p>
+    <w:p/>
+    <w:p>
+      <w:pPr>
+        <w:pStyle w:val="Heading5"/>
+      </w:pPr>
+      <w:r>
+        <w:rPr>
+          <w:rFonts w:ascii="Calibri" w:hAnsi="Calibri" w:eastAsia="Microsoft YaHei"/>
+        </w:rPr>
+        <w:t>ModeA</w:t>
+      </w:r>
+    </w:p>
+    <w:p/>
+    <w:p>
+      <w:pPr>
+        <w:pStyle w:val="Normal"/>
+      </w:pPr>
+      <w:r>
+        <w:rPr>
+          <w:rFonts w:ascii="Consolas" w:hAnsi="Consolas" w:eastAsia="Microsoft YaHei"/>
+          <w:color w:val="1F1F1F"/>
+        </w:rPr>
+        <w:t>WC_Heatmap</w:t>
+      </w:r>
+      <w:r>
+        <w:rPr>
+          <w:rFonts w:ascii="Calibri" w:hAnsi="Calibri" w:eastAsia="Microsoft YaHei"/>
+        </w:rPr>
+        <w:t xml:space="preserve"> / </w:t>
+      </w:r>
+      <w:r>
+        <w:rPr>
+          <w:rFonts w:ascii="Consolas" w:hAnsi="Consolas" w:eastAsia="Microsoft YaHei"/>
+          <w:color w:val="1F1F1F"/>
+        </w:rPr>
+        <w:t>Bottleneck</w:t>
+      </w:r>
+      <w:r>
+        <w:rPr>
+          <w:rFonts w:ascii="Calibri" w:hAnsi="Calibri" w:eastAsia="Microsoft YaHei"/>
+        </w:rPr>
+        <w:t xml:space="preserve"> 的压力按以下方式计算：</w:t>
+      </w:r>
+    </w:p>
+    <w:p/>
+    <w:p>
+      <w:pPr>
+        <w:pStyle w:val="CodeBlock"/>
+      </w:pPr>
+      <w:r>
+        <w:rPr>
+          <w:rFonts w:ascii="Consolas" w:hAnsi="Consolas" w:eastAsia="Microsoft YaHei"/>
+          <w:color w:val="1F1F1F"/>
+        </w:rPr>
+        <w:t>Internal Allocation + Assigned Unmet</w:t>
+      </w:r>
+    </w:p>
+    <w:p/>
+    <w:p>
+      <w:pPr>
+        <w:pStyle w:val="Normal"/>
+      </w:pPr>
+      <w:r>
+        <w:rPr>
+          <w:rFonts w:ascii="Calibri" w:hAnsi="Calibri" w:eastAsia="Microsoft YaHei"/>
+        </w:rPr>
+        <w:t xml:space="preserve">其中 </w:t>
+      </w:r>
+      <w:r>
+        <w:rPr>
+          <w:rFonts w:ascii="Consolas" w:hAnsi="Consolas" w:eastAsia="Microsoft YaHei"/>
+          <w:color w:val="1F1F1F"/>
+        </w:rPr>
+        <w:t>Unmet</w:t>
+      </w:r>
+      <w:r>
+        <w:rPr>
+          <w:rFonts w:ascii="Calibri" w:hAnsi="Calibri" w:eastAsia="Microsoft YaHei"/>
+        </w:rPr>
+        <w:t xml:space="preserve"> 的归属规则为：</w:t>
+      </w:r>
+    </w:p>
+    <w:p/>
+    <w:p>
+      <w:pPr>
+        <w:pStyle w:val="ListBullet"/>
+        <w:numPr>
+          <w:ilvl w:val="0"/>
+          <w:numId w:val="2"/>
+        </w:numPr>
+      </w:pPr>
+      <w:r>
+        <w:rPr>
+          <w:rFonts w:ascii="Calibri" w:hAnsi="Calibri" w:eastAsia="Microsoft YaHei"/>
+        </w:rPr>
+        <w:t xml:space="preserve">如果某个 </w:t>
+      </w:r>
+      <w:r>
+        <w:rPr>
+          <w:rFonts w:ascii="Consolas" w:hAnsi="Consolas" w:eastAsia="Microsoft YaHei"/>
+          <w:color w:val="1F1F1F"/>
+        </w:rPr>
+        <w:t>Product</w:t>
+      </w:r>
+      <w:r>
+        <w:rPr>
+          <w:rFonts w:ascii="Calibri" w:hAnsi="Calibri" w:eastAsia="Microsoft YaHei"/>
+        </w:rPr>
+        <w:t xml:space="preserve"> 最终只对应一个 planner-resource 责任资源，则全部 </w:t>
+      </w:r>
+      <w:r>
+        <w:rPr>
+          <w:rFonts w:ascii="Consolas" w:hAnsi="Consolas" w:eastAsia="Microsoft YaHei"/>
+          <w:color w:val="1F1F1F"/>
+        </w:rPr>
+        <w:t>Unmet</w:t>
+      </w:r>
+      <w:r>
+        <w:rPr>
+          <w:rFonts w:ascii="Calibri" w:hAnsi="Calibri" w:eastAsia="Microsoft YaHei"/>
+        </w:rPr>
+        <w:t xml:space="preserve"> 归到该资源</w:t>
+      </w:r>
+    </w:p>
+    <w:p>
+      <w:pPr>
+        <w:pStyle w:val="ListBullet"/>
+        <w:numPr>
+          <w:ilvl w:val="0"/>
+          <w:numId w:val="2"/>
+        </w:numPr>
+      </w:pPr>
+      <w:r>
+        <w:rPr>
+          <w:rFonts w:ascii="Calibri" w:hAnsi="Calibri" w:eastAsia="Microsoft YaHei"/>
+        </w:rPr>
+        <w:t xml:space="preserve">如果多个 planner 对同一个 </w:t>
+      </w:r>
+      <w:r>
+        <w:rPr>
+          <w:rFonts w:ascii="Consolas" w:hAnsi="Consolas" w:eastAsia="Microsoft YaHei"/>
+          <w:color w:val="1F1F1F"/>
+        </w:rPr>
+        <w:t>Product</w:t>
+      </w:r>
+      <w:r>
+        <w:rPr>
+          <w:rFonts w:ascii="Calibri" w:hAnsi="Calibri" w:eastAsia="Microsoft YaHei"/>
+        </w:rPr>
+        <w:t xml:space="preserve"> 定义了不同资源，则先按 planner 的需求吨位占比拆分 </w:t>
+      </w:r>
+      <w:r>
+        <w:rPr>
+          <w:rFonts w:ascii="Consolas" w:hAnsi="Consolas" w:eastAsia="Microsoft YaHei"/>
+          <w:color w:val="1F1F1F"/>
+        </w:rPr>
+        <w:t>Unmet</w:t>
+      </w:r>
+      <w:r>
+        <w:rPr>
+          <w:rFonts w:ascii="Calibri" w:hAnsi="Calibri" w:eastAsia="Microsoft YaHei"/>
+        </w:rPr>
+        <w:t>，再归到各自资源</w:t>
+      </w:r>
+    </w:p>
+    <w:p/>
+    <w:p>
+      <w:pPr>
+        <w:pStyle w:val="Heading5"/>
+      </w:pPr>
+      <w:r>
+        <w:rPr>
+          <w:rFonts w:ascii="Calibri" w:hAnsi="Calibri" w:eastAsia="Microsoft YaHei"/>
+        </w:rPr>
+        <w:t>ModeB</w:t>
+      </w:r>
+    </w:p>
+    <w:p/>
+    <w:p>
+      <w:pPr>
+        <w:pStyle w:val="Normal"/>
+      </w:pPr>
+      <w:r>
+        <w:rPr>
+          <w:rFonts w:ascii="Consolas" w:hAnsi="Consolas" w:eastAsia="Microsoft YaHei"/>
+          <w:color w:val="1F1F1F"/>
+        </w:rPr>
+        <w:t>WC_Heatmap</w:t>
+      </w:r>
+      <w:r>
+        <w:rPr>
+          <w:rFonts w:ascii="Calibri" w:hAnsi="Calibri" w:eastAsia="Microsoft YaHei"/>
+        </w:rPr>
+        <w:t xml:space="preserve"> / </w:t>
+      </w:r>
+      <w:r>
+        <w:rPr>
+          <w:rFonts w:ascii="Consolas" w:hAnsi="Consolas" w:eastAsia="Microsoft YaHei"/>
+          <w:color w:val="1F1F1F"/>
+        </w:rPr>
+        <w:t>Bottleneck</w:t>
+      </w:r>
+      <w:r>
+        <w:rPr>
+          <w:rFonts w:ascii="Calibri" w:hAnsi="Calibri" w:eastAsia="Microsoft YaHei"/>
+        </w:rPr>
+        <w:t xml:space="preserve"> 同样显示：</w:t>
+      </w:r>
+    </w:p>
+    <w:p/>
+    <w:p>
+      <w:pPr>
+        <w:pStyle w:val="CodeBlock"/>
+      </w:pPr>
+      <w:r>
+        <w:rPr>
+          <w:rFonts w:ascii="Consolas" w:hAnsi="Consolas" w:eastAsia="Microsoft YaHei"/>
+          <w:color w:val="1F1F1F"/>
+        </w:rPr>
+        <w:t>Internal Allocation + Assigned Unmet</w:t>
+      </w:r>
+    </w:p>
+    <w:p/>
+    <w:p>
+      <w:pPr>
+        <w:pStyle w:val="Normal"/>
+      </w:pPr>
+      <w:r>
+        <w:rPr>
+          <w:rFonts w:ascii="Calibri" w:hAnsi="Calibri" w:eastAsia="Microsoft YaHei"/>
+        </w:rPr>
+        <w:t>注意：</w:t>
+      </w:r>
+    </w:p>
+    <w:p/>
+    <w:p>
+      <w:pPr>
+        <w:pStyle w:val="ListBullet"/>
+        <w:numPr>
+          <w:ilvl w:val="0"/>
+          <w:numId w:val="2"/>
+        </w:numPr>
+      </w:pPr>
+      <w:r>
+        <w:rPr>
+          <w:rFonts w:ascii="Consolas" w:hAnsi="Consolas" w:eastAsia="Microsoft YaHei"/>
+          <w:color w:val="1F1F1F"/>
+        </w:rPr>
+        <w:t>Outsourced</w:t>
+      </w:r>
+      <w:r>
+        <w:rPr>
+          <w:rFonts w:ascii="Calibri" w:hAnsi="Calibri" w:eastAsia="Microsoft YaHei"/>
+        </w:rPr>
+        <w:t xml:space="preserve"> **不进入**热力图和瓶颈页</w:t>
+      </w:r>
+    </w:p>
+    <w:p>
+      <w:pPr>
+        <w:pStyle w:val="ListBullet"/>
+        <w:numPr>
+          <w:ilvl w:val="0"/>
+          <w:numId w:val="2"/>
+        </w:numPr>
+      </w:pPr>
+      <w:r>
+        <w:rPr>
+          <w:rFonts w:ascii="Consolas" w:hAnsi="Consolas" w:eastAsia="Microsoft YaHei"/>
+          <w:color w:val="1F1F1F"/>
+        </w:rPr>
+        <w:t>Outsourced</w:t>
+      </w:r>
+      <w:r>
+        <w:rPr>
+          <w:rFonts w:ascii="Calibri" w:hAnsi="Calibri" w:eastAsia="Microsoft YaHei"/>
+        </w:rPr>
+        <w:t xml:space="preserve"> 仍会出现在 </w:t>
+      </w:r>
+      <w:r>
+        <w:rPr>
+          <w:rFonts w:ascii="Consolas" w:hAnsi="Consolas" w:eastAsia="Microsoft YaHei"/>
+          <w:color w:val="1F1F1F"/>
+        </w:rPr>
+        <w:t>Dashboard</w:t>
+      </w:r>
+      <w:r>
+        <w:rPr>
+          <w:rFonts w:ascii="Calibri" w:hAnsi="Calibri" w:eastAsia="Microsoft YaHei"/>
+        </w:rPr>
+        <w:t xml:space="preserve"> 和其他结果汇总中</w:t>
+      </w:r>
+    </w:p>
+    <w:p/>
+    <w:p>
+      <w:pPr>
+        <w:pStyle w:val="Normal"/>
+      </w:pPr>
+      <w:r>
+        <w:rPr>
+          <w:rFonts w:ascii="Calibri" w:hAnsi="Calibri" w:eastAsia="Microsoft YaHei"/>
+        </w:rPr>
+        <w:t xml:space="preserve">ModeB 中 </w:t>
+      </w:r>
+      <w:r>
+        <w:rPr>
+          <w:rFonts w:ascii="Consolas" w:hAnsi="Consolas" w:eastAsia="Microsoft YaHei"/>
+          <w:color w:val="1F1F1F"/>
+        </w:rPr>
+        <w:t>Unmet</w:t>
+      </w:r>
+      <w:r>
+        <w:rPr>
+          <w:rFonts w:ascii="Calibri" w:hAnsi="Calibri" w:eastAsia="Microsoft YaHei"/>
+        </w:rPr>
+        <w:t xml:space="preserve"> 的归属规则为：</w:t>
+      </w:r>
+    </w:p>
+    <w:p/>
+    <w:p>
+      <w:pPr>
+        <w:pStyle w:val="ListBullet"/>
+        <w:numPr>
+          <w:ilvl w:val="0"/>
+          <w:numId w:val="2"/>
+        </w:numPr>
+      </w:pPr>
+      <w:r>
+        <w:rPr>
+          <w:rFonts w:ascii="Calibri" w:hAnsi="Calibri" w:eastAsia="Microsoft YaHei"/>
+        </w:rPr>
+        <w:t xml:space="preserve">如果 </w:t>
+      </w:r>
+      <w:r>
+        <w:rPr>
+          <w:rFonts w:ascii="Consolas" w:hAnsi="Consolas" w:eastAsia="Microsoft YaHei"/>
+          <w:color w:val="1F1F1F"/>
+        </w:rPr>
+        <w:t>Product</w:t>
+      </w:r>
+      <w:r>
+        <w:rPr>
+          <w:rFonts w:ascii="Calibri" w:hAnsi="Calibri" w:eastAsia="Microsoft YaHei"/>
+        </w:rPr>
+        <w:t xml:space="preserve"> 在 </w:t>
+      </w:r>
+      <w:r>
+        <w:rPr>
+          <w:rFonts w:ascii="Consolas" w:hAnsi="Consolas" w:eastAsia="Microsoft YaHei"/>
+          <w:color w:val="1F1F1F"/>
+        </w:rPr>
+        <w:t>master_routing</w:t>
+      </w:r>
+      <w:r>
+        <w:rPr>
+          <w:rFonts w:ascii="Calibri" w:hAnsi="Calibri" w:eastAsia="Microsoft YaHei"/>
+        </w:rPr>
+        <w:t xml:space="preserve"> 中有 product-level </w:t>
+      </w:r>
+      <w:r>
+        <w:rPr>
+          <w:rFonts w:ascii="Consolas" w:hAnsi="Consolas" w:eastAsia="Microsoft YaHei"/>
+          <w:color w:val="1F1F1F"/>
+        </w:rPr>
+        <w:t>Primary</w:t>
+      </w:r>
+      <w:r>
+        <w:rPr>
+          <w:rFonts w:ascii="Calibri" w:hAnsi="Calibri" w:eastAsia="Microsoft YaHei"/>
+        </w:rPr>
+        <w:t xml:space="preserve">，则 </w:t>
+      </w:r>
+      <w:r>
+        <w:rPr>
+          <w:rFonts w:ascii="Consolas" w:hAnsi="Consolas" w:eastAsia="Microsoft YaHei"/>
+          <w:color w:val="1F1F1F"/>
+        </w:rPr>
+        <w:t>Unmet -&gt; Primary</w:t>
+      </w:r>
+    </w:p>
+    <w:p>
+      <w:pPr>
+        <w:pStyle w:val="ListBullet"/>
+        <w:numPr>
+          <w:ilvl w:val="0"/>
+          <w:numId w:val="2"/>
+        </w:numPr>
+      </w:pPr>
+      <w:r>
+        <w:rPr>
+          <w:rFonts w:ascii="Calibri" w:hAnsi="Calibri" w:eastAsia="Microsoft YaHei"/>
+        </w:rPr>
+        <w:t xml:space="preserve">如果 </w:t>
+      </w:r>
+      <w:r>
+        <w:rPr>
+          <w:rFonts w:ascii="Consolas" w:hAnsi="Consolas" w:eastAsia="Microsoft YaHei"/>
+          <w:color w:val="1F1F1F"/>
+        </w:rPr>
+        <w:t>Product</w:t>
+      </w:r>
+      <w:r>
+        <w:rPr>
+          <w:rFonts w:ascii="Calibri" w:hAnsi="Calibri" w:eastAsia="Microsoft YaHei"/>
+        </w:rPr>
+        <w:t xml:space="preserve"> 不在 </w:t>
+      </w:r>
+      <w:r>
+        <w:rPr>
+          <w:rFonts w:ascii="Consolas" w:hAnsi="Consolas" w:eastAsia="Microsoft YaHei"/>
+          <w:color w:val="1F1F1F"/>
+        </w:rPr>
+        <w:t>master_routing</w:t>
+      </w:r>
+      <w:r>
+        <w:rPr>
+          <w:rFonts w:ascii="Calibri" w:hAnsi="Calibri" w:eastAsia="Microsoft YaHei"/>
+        </w:rPr>
+        <w:t xml:space="preserve"> 中，则忽略 planner，基于 </w:t>
+      </w:r>
+      <w:r>
+        <w:rPr>
+          <w:rFonts w:ascii="Consolas" w:hAnsi="Consolas" w:eastAsia="Microsoft YaHei"/>
+          <w:color w:val="1F1F1F"/>
+        </w:rPr>
+        <w:t>master_capacity</w:t>
+      </w:r>
+      <w:r>
+        <w:rPr>
+          <w:rFonts w:ascii="Calibri" w:hAnsi="Calibri" w:eastAsia="Microsoft YaHei"/>
+        </w:rPr>
+        <w:t xml:space="preserve"> 中该 </w:t>
+      </w:r>
+      <w:r>
+        <w:rPr>
+          <w:rFonts w:ascii="Consolas" w:hAnsi="Consolas" w:eastAsia="Microsoft YaHei"/>
+          <w:color w:val="1F1F1F"/>
+        </w:rPr>
+        <w:t>Product</w:t>
+      </w:r>
+      <w:r>
+        <w:rPr>
+          <w:rFonts w:ascii="Calibri" w:hAnsi="Calibri" w:eastAsia="Microsoft YaHei"/>
+        </w:rPr>
+        <w:t xml:space="preserve"> 的所有资源，用 OR-Tools 求一个最小化最大资源压力的最优分配，再把 </w:t>
+      </w:r>
+      <w:r>
+        <w:rPr>
+          <w:rFonts w:ascii="Consolas" w:hAnsi="Consolas" w:eastAsia="Microsoft YaHei"/>
+          <w:color w:val="1F1F1F"/>
+        </w:rPr>
+        <w:t>Unmet</w:t>
+      </w:r>
+      <w:r>
+        <w:rPr>
+          <w:rFonts w:ascii="Calibri" w:hAnsi="Calibri" w:eastAsia="Microsoft YaHei"/>
+        </w:rPr>
+        <w:t xml:space="preserve"> 分配回这些资源</w:t>
+      </w:r>
+    </w:p>
+    <w:p/>
+    <w:p>
+      <w:pPr>
+        <w:pStyle w:val="Normal"/>
+      </w:pPr>
+      <w:r>
+        <w:rPr>
+          <w:rFonts w:ascii="Calibri" w:hAnsi="Calibri" w:eastAsia="Microsoft YaHei"/>
+        </w:rPr>
+        <w:t>因此，当前热力图和瓶颈页中的负荷百分比：</w:t>
+      </w:r>
+    </w:p>
+    <w:p/>
+    <w:p>
+      <w:pPr>
+        <w:pStyle w:val="ListBullet"/>
+        <w:numPr>
+          <w:ilvl w:val="0"/>
+          <w:numId w:val="2"/>
+        </w:numPr>
+      </w:pPr>
+      <w:r>
+        <w:rPr>
+          <w:rFonts w:ascii="Calibri" w:hAnsi="Calibri" w:eastAsia="Microsoft YaHei"/>
+        </w:rPr>
+        <w:t xml:space="preserve">可以高于 </w:t>
+      </w:r>
+      <w:r>
+        <w:rPr>
+          <w:rFonts w:ascii="Consolas" w:hAnsi="Consolas" w:eastAsia="Microsoft YaHei"/>
+          <w:color w:val="1F1F1F"/>
+        </w:rPr>
+        <w:t>100%</w:t>
+      </w:r>
+    </w:p>
+    <w:p>
+      <w:pPr>
+        <w:pStyle w:val="ListBullet"/>
+        <w:numPr>
+          <w:ilvl w:val="0"/>
+          <w:numId w:val="2"/>
+        </w:numPr>
+      </w:pPr>
+      <w:r>
+        <w:rPr>
+          <w:rFonts w:ascii="Calibri" w:hAnsi="Calibri" w:eastAsia="Microsoft YaHei"/>
+        </w:rPr>
+        <w:t xml:space="preserve">高于 </w:t>
+      </w:r>
+      <w:r>
+        <w:rPr>
+          <w:rFonts w:ascii="Consolas" w:hAnsi="Consolas" w:eastAsia="Microsoft YaHei"/>
+          <w:color w:val="1F1F1F"/>
+        </w:rPr>
+        <w:t>100%</w:t>
+      </w:r>
+      <w:r>
+        <w:rPr>
+          <w:rFonts w:ascii="Calibri" w:hAnsi="Calibri" w:eastAsia="Microsoft YaHei"/>
+        </w:rPr>
+        <w:t xml:space="preserve"> 表示该资源在名义产能口径下已经存在真实压力溢出</w:t>
       </w:r>
     </w:p>
     <w:p/>

</xml_diff>